<commit_message>
corrige dos imprecisiones del sustento de MAC Anticipa
- la cifra de 1 787 261 visitas cubre museos Y salas de exposicion; los 56
  museos son un dato aparte del mismo informe
- añade la unidad de analisis de Tian et al.: panel de museos con
  prediccion anual, no serie diaria de una sola institucion, y que el
  modelo ganador fue el Transformer
</commit_message>
<xml_diff>
--- a/3-documento/trabajo/Plan_de_Trabajo_Investigacion_MAC_Anticipa_Semana_2.docx
+++ b/3-documento/trabajo/Plan_de_Trabajo_Investigacion_MAC_Anticipa_Semana_2.docx
@@ -289,13 +289,7 @@
           <w:b/>
           <w:lang w:val="es-PE"/>
         </w:rPr>
-        <w:t xml:space="preserve">Contexto e importancia. </w:t>
-      </w:r>
-      <w:r>
-        <w:rPr>
-          <w:lang w:val="es-PE"/>
-        </w:rPr>
-        <w:t>La asistencia es un indicador central para la gestión museal. En 2024, los 56 museos administrados por el Ministerio de Cultura registraron 1 787 261 visitas; el 57,6 % correspondió a adultos y el 25,7 % a niños (Ministerio de Cultura, 2025). En el MAC Lima, las cifras institucionales preliminares superan los 45 000 visitantes anuales y alrededor de 8 000 participaciones en actividades públicas gratuitas (MAC Lima, 2026). Estas cifras muestran que incluso un museo de pequeña escala debe prever variaciones de demanda para distribuir recursos escasos.</w:t>
+        <w:t>Contexto e importancia. La asistencia es un indicador central para la gestión museal. En 2024, los museos y salas de exposición del Ministerio de Cultura registraron 1 787 261 visitas; el 57,6 % correspondió a adultos y el 25,7 % a niños. El Ministerio administra 56 museos a nivel nacional (Ministerio de Cultura, 2025). En el MAC Lima, las cifras institucionales preliminares superan los 45 000 visitantes anuales y alrededor de 8 000 participaciones en actividades públicas gratuitas (MAC Lima, 2026). Estas cifras muestran que incluso un museo de pequeña escala debe prever variaciones de demanda para distribuir recursos escasos.</w:t>
       </w:r>
     </w:p>
     <w:p>
@@ -355,14 +349,7 @@
           <w:b/>
           <w:lang w:val="es-PE"/>
         </w:rPr>
-        <w:lastRenderedPageBreak/>
-        <w:t xml:space="preserve">Antecedentes técnicos. </w:t>
-      </w:r>
-      <w:r>
-        <w:rPr>
-          <w:lang w:val="es-PE"/>
-        </w:rPr>
-        <w:t>Bravo et al. (2023) compararon regresión lineal, KNN, árbol de decisión y random forest para predecir visitantes en la Ruta Moche con datos peruanos; la regresión lineal obtuvo el mejor desempeño en su conjunto de datos. Tian et al. (2025) evaluaron siete algoritmos para museos e informaron que la integración de datos estructurados y variables externas puede mejorar la precisión. Ambos estudios respaldan la comparación empírica de modelos, pero también indican que la técnica ganadora depende de los datos disponibles. Por ello, el proyecto no elegirá de antemano el algoritmo final.</w:t>
+        <w:t>Antecedentes técnicos. Bravo et al. (2023) compararon regresión lineal, KNN, árbol de decisión y random forest para predecir visitantes en la Ruta Moche con datos peruanos; la regresión lineal obtuvo el mejor desempeño en su conjunto de datos. Tian et al. (2025) evaluaron siete algoritmos —entre ellos regresión lineal, random forest, LSTM y Transformer— sobre un panel de museos e informaron que la integración de datos estructurados con datos de sentimiento mejora la precisión, siendo el Transformer el modelo de mejor desempeño; no obstante, su unidad de análisis es el total anual de un conjunto amplio de museos y no la serie diaria o semanal de una sola institución. Ambos estudios respaldan la comparación empírica de modelos, pero también indican que la técnica ganadora depende de los datos disponibles. Por ello, el proyecto no elegirá de antemano el algoritmo final.</w:t>
       </w:r>
     </w:p>
     <w:p>

</xml_diff>

<commit_message>
repara el formato de los dos parrafos corregidos
Al reemplazar el texto habia colapsado los dos runs de cada parrafo en
uno solo, y como el primero era el rotulo en negrita, todo el parrafo
heredo la negrita. Restaurada la estructura original: rotulo en negrita
mas cuerpo sin negrita.
</commit_message>
<xml_diff>
--- a/3-documento/trabajo/Plan_de_Trabajo_Investigacion_MAC_Anticipa_Semana_2.docx
+++ b/3-documento/trabajo/Plan_de_Trabajo_Investigacion_MAC_Anticipa_Semana_2.docx
@@ -289,7 +289,13 @@
           <w:b/>
           <w:lang w:val="es-PE"/>
         </w:rPr>
-        <w:t>Contexto e importancia. La asistencia es un indicador central para la gestión museal. En 2024, los museos y salas de exposición del Ministerio de Cultura registraron 1 787 261 visitas; el 57,6 % correspondió a adultos y el 25,7 % a niños. El Ministerio administra 56 museos a nivel nacional (Ministerio de Cultura, 2025). En el MAC Lima, las cifras institucionales preliminares superan los 45 000 visitantes anuales y alrededor de 8 000 participaciones en actividades públicas gratuitas (MAC Lima, 2026). Estas cifras muestran que incluso un museo de pequeña escala debe prever variaciones de demanda para distribuir recursos escasos.</w:t>
+        <w:t xml:space="preserve">Contexto e importancia. </w:t>
+      </w:r>
+      <w:r>
+        <w:rPr>
+          <w:lang w:val="es-PE"/>
+        </w:rPr>
+        <w:t>La asistencia es un indicador central para la gestión museal. En 2024, los museos y salas de exposición del Ministerio de Cultura registraron 1 787 261 visitas; el 57,6 % correspondió a adultos y el 25,7 % a niños. El Ministerio administra 56 museos a nivel nacional (Ministerio de Cultura, 2025). En el MAC Lima, las cifras institucionales preliminares superan los 45 000 visitantes anuales y alrededor de 8 000 participaciones en actividades públicas gratuitas (MAC Lima, 2026). Estas cifras muestran que incluso un museo de pequeña escala debe prever variaciones de demanda para distribuir recursos escasos.</w:t>
       </w:r>
     </w:p>
     <w:p>
@@ -349,7 +355,13 @@
           <w:b/>
           <w:lang w:val="es-PE"/>
         </w:rPr>
-        <w:t>Antecedentes técnicos. Bravo et al. (2023) compararon regresión lineal, KNN, árbol de decisión y random forest para predecir visitantes en la Ruta Moche con datos peruanos; la regresión lineal obtuvo el mejor desempeño en su conjunto de datos. Tian et al. (2025) evaluaron siete algoritmos —entre ellos regresión lineal, random forest, LSTM y Transformer— sobre un panel de museos e informaron que la integración de datos estructurados con datos de sentimiento mejora la precisión, siendo el Transformer el modelo de mejor desempeño; no obstante, su unidad de análisis es el total anual de un conjunto amplio de museos y no la serie diaria o semanal de una sola institución. Ambos estudios respaldan la comparación empírica de modelos, pero también indican que la técnica ganadora depende de los datos disponibles. Por ello, el proyecto no elegirá de antemano el algoritmo final.</w:t>
+        <w:t xml:space="preserve">Antecedentes técnicos. </w:t>
+      </w:r>
+      <w:r>
+        <w:rPr>
+          <w:lang w:val="es-PE"/>
+        </w:rPr>
+        <w:t>Bravo et al. (2023) compararon regresión lineal, KNN, árbol de decisión y random forest para predecir visitantes en la Ruta Moche con datos peruanos; la regresión lineal obtuvo el mejor desempeño en su conjunto de datos. Tian et al. (2025) evaluaron siete algoritmos —entre ellos regresión lineal, random forest, LSTM y Transformer— sobre un panel de museos e informaron que la integración de datos estructurados con datos de sentimiento mejora la precisión, siendo el Transformer el modelo de mejor desempeño; no obstante, su unidad de análisis es el total anual de un conjunto amplio de museos y no la serie diaria o semanal de una sola institución. Ambos estudios respaldan la comparación empírica de modelos, pero también indican que la técnica ganadora depende de los datos disponibles. Por ello, el proyecto no elegirá de antemano el algoritmo final.</w:t>
       </w:r>
     </w:p>
     <w:p>

</xml_diff>